<commit_message>
Redesign Arabic executive overview with clearer typography and concise wording
</commit_message>
<xml_diff>
--- a/Activity_Platform_Executive_Overview.docx
+++ b/Activity_Platform_Executive_Overview.docx
@@ -4,243 +4,218 @@
   <w:body>
     <w:p>
       <w:pPr>
-        <w:pStyle w:val="Title"/>
-        <w:jc w:val="left"/>
-        <w:bidi/>
+        <w:widowControl/>
+        <w:bidi w:val="1"/>
+        <w:jc w:val="start"/>
       </w:pPr>
       <w:r>
         <w:rPr>
-          <w:b w:val="0"/>
-          <w:rtl/>
+          <w:rFonts w:ascii="Noto Sans Arabic" w:hAnsi="Noto Sans Arabic" w:cs="Noto Sans Arabic" w:eastAsia="Noto Sans Arabic"/>
+          <w:sz w:val="20"/>
+          <w:szCs w:val="20"/>
+          <w:rtl w:val="1"/>
+          <w:lang w:bidi="ar-EG"/>
+          <w:color w:val="246D75"/>
+          <w:b w:val="1"/>
+          <w:bCs w:val="1"/>
         </w:rPr>
-        <w:t>العرض التنفيذي</w:t>
+        <w:t>العرض التنفيذي  /  ٠١</w:t>
       </w:r>
     </w:p>
     <w:p>
       <w:pPr>
-        <w:pStyle w:val="Heading1"/>
-        <w:jc w:val="left"/>
-        <w:bidi/>
+        <w:pStyle w:val="Title"/>
+        <w:widowControl/>
+        <w:bidi w:val="1"/>
+        <w:jc w:val="start"/>
       </w:pPr>
       <w:r>
-        <w:rPr>
-          <w:b w:val="0"/>
-          <w:rtl/>
-        </w:rPr>
         <w:t>منظومة تسجيل النشاط الطلابي</w:t>
         <w:br/>
-        <w:t>ومراجعته واعتماده بكلية التجارة</w:t>
+        <w:t>واعتماده بكلية التجارة</w:t>
       </w:r>
     </w:p>
     <w:p>
       <w:pPr>
-        <w:jc w:val="left"/>
-        <w:bidi/>
+        <w:widowControl/>
+        <w:bidi w:val="1"/>
+        <w:jc w:val="start"/>
       </w:pPr>
       <w:r>
-        <w:rPr>
-          <w:b/>
-          <w:rtl/>
-        </w:rPr>
-        <w:t>وثيقة توضيحية لنطاق العمل وآلية التنفيذ</w:t>
+        <w:t>بناءً على توجيهات سيادتكم، يوضح هذا العرض ما سيتم تنفيذه وآلية استخدام المنظومة، بدءًا بنسخة خاصة بكلية التجارة، ثم تعميم التجربة بعد اختبارها والتأكد من جاهزيتها.</w:t>
       </w:r>
     </w:p>
     <w:p>
       <w:pPr>
-        <w:jc w:val="left"/>
-        <w:bidi/>
+        <w:widowControl/>
+        <w:bidi w:val="1"/>
+        <w:spacing w:before="100" w:after="200"/>
+        <w:jc w:val="start"/>
+        <w:shd w:fill="EDF4F5"/>
       </w:pPr>
       <w:r>
         <w:rPr>
-          <w:b w:val="0"/>
-          <w:rtl/>
+          <w:rFonts w:ascii="Noto Sans Arabic" w:hAnsi="Noto Sans Arabic" w:cs="Noto Sans Arabic" w:eastAsia="Noto Sans Arabic"/>
+          <w:sz w:val="22"/>
+          <w:szCs w:val="22"/>
+          <w:rtl w:val="1"/>
+          <w:lang w:bidi="ar-EG"/>
+          <w:color w:val="18394D"/>
+          <w:b w:val="1"/>
+          <w:bCs w:val="1"/>
         </w:rPr>
-        <w:t>السيدة الأستاذة الدكتورة/ نائب رئيس الجامعة المحترمة،</w:t>
-      </w:r>
-    </w:p>
-    <w:p>
-      <w:pPr>
-        <w:jc w:val="left"/>
-        <w:bidi/>
-      </w:pPr>
-      <w:r>
-        <w:rPr>
-          <w:b w:val="0"/>
-          <w:rtl/>
-        </w:rPr>
-        <w:t>تحية طيبة وبعد،</w:t>
-      </w:r>
-    </w:p>
-    <w:p>
-      <w:pPr>
-        <w:jc w:val="left"/>
-        <w:bidi/>
-      </w:pPr>
-      <w:r>
-        <w:rPr>
-          <w:b w:val="0"/>
-          <w:rtl/>
-        </w:rPr>
-        <w:t>بناءً على توجيهات سيادتكم، يوضح هذا العرض مكونات المنظومة الإلكترونية المزمع تنفيذها، ودورة العمل بين الطالب والموظف المختص، وخطوات الاختبار والتشغيل، بدءًا بكلية التجارة تمهيدًا للتعميم على كليات الجامعة.</w:t>
+        <w:t>نشاط واحد للطالب  •  ٤٠ درجة كاملة بعد الاعتماد</w:t>
       </w:r>
     </w:p>
     <w:p>
       <w:pPr>
         <w:pStyle w:val="Heading2"/>
-        <w:jc w:val="left"/>
-        <w:bidi/>
+        <w:widowControl/>
+        <w:bidi w:val="1"/>
+        <w:jc w:val="start"/>
       </w:pPr>
       <w:r>
-        <w:rPr>
-          <w:b w:val="0"/>
-          <w:rtl/>
-        </w:rPr>
-        <w:t>١. الهدف ونطاق العمل</w:t>
+        <w:t>الفكرة ونطاق التنفيذ</w:t>
       </w:r>
     </w:p>
     <w:p>
       <w:pPr>
-        <w:jc w:val="left"/>
-        <w:bidi/>
+        <w:widowControl/>
+        <w:bidi w:val="1"/>
+        <w:jc w:val="start"/>
       </w:pPr>
       <w:r>
-        <w:rPr>
-          <w:b w:val="0"/>
-          <w:rtl/>
-        </w:rPr>
-        <w:t>إنشاء موقع مستقل لكلية التجارة وطلابها، يتيح تسجيل النشاط ورفع مستنداته وإصدار استمارته، ثم متابعة مراجعته واعتماده. ويشمل العمل واجهة للطالب، ولوحة للموظفين، وإدارة للصلاحيات، وحفظ الطلبات والمرفقات وسجل الإجراءات، مع تهيئة الربط بالنظام المركزي للجامعة.</w:t>
-      </w:r>
-    </w:p>
-    <w:p>
-      <w:pPr>
-        <w:jc w:val="left"/>
-        <w:bidi/>
-      </w:pPr>
-      <w:r>
-        <w:rPr>
-          <w:b w:val="0"/>
-          <w:rtl/>
-        </w:rPr>
-        <w:t>وفق التصور الحالي، يقدم الطالب نشاطًا واحدًا يستحق عنه ٤٠ درجة كاملة بعد الاعتماد. ولا تُحتسب درجات عند تقديم الطلب أو تنزيل الاستمارة. وتُحدد الفترة الدراسية وقواعد الاستحقاق بالتنسيق مع الجهة المختصة قبل التشغيل.</w:t>
+        <w:t>موقع مستقل بهوية كلية التجارة، يتيح للطالب تقديم نشاطه وإرفاق مستنداته واستخراج استمارته، ثم متابعة المراجعة. ويشمل واجهة للطلاب، ولوحة للموظفين، وإدارة للحسابات والصلاحيات، وحفظ الطلبات والمرفقات وقرارات الاعتماد.</w:t>
       </w:r>
     </w:p>
     <w:p>
       <w:pPr>
         <w:pStyle w:val="Heading2"/>
-        <w:jc w:val="left"/>
-        <w:bidi/>
+        <w:widowControl/>
+        <w:bidi w:val="1"/>
+        <w:jc w:val="start"/>
       </w:pPr>
       <w:r>
-        <w:rPr>
-          <w:b w:val="0"/>
-          <w:rtl/>
-        </w:rPr>
-        <w:t>٢. رحلة الطالب داخل المنظومة</w:t>
+        <w:t>خطوات تقديم النشاط</w:t>
       </w:r>
     </w:p>
     <w:p>
       <w:pPr>
-        <w:jc w:val="left"/>
-        <w:bidi/>
+        <w:bidi w:val="1"/>
+        <w:jc w:val="start"/>
       </w:pPr>
       <w:r>
         <w:rPr>
-          <w:b w:val="0"/>
-          <w:rtl/>
+          <w:rFonts w:ascii="Noto Sans Arabic" w:hAnsi="Noto Sans Arabic" w:cs="Noto Sans Arabic" w:eastAsia="Noto Sans Arabic"/>
+          <w:sz w:val="22"/>
+          <w:szCs w:val="22"/>
+          <w:rtl w:val="1"/>
+          <w:lang w:bidi="ar-EG"/>
+          <w:color w:val="18394D"/>
+          <w:b w:val="1"/>
+          <w:bCs w:val="1"/>
         </w:rPr>
-        <w:t>١. تسجيل الدخول والتحقق من انتماء الطالب للكلية، وربط الحساب ببياناته الرسمية.</w:t>
+        <w:t xml:space="preserve">١.  الدخول والتحقق:  </w:t>
+      </w:r>
+      <w:r>
+        <w:t>يدخل الطالب بحسابه، وتُربط هويته ببياناته الرسمية للتأكد من انتمائه للكلية.</w:t>
       </w:r>
     </w:p>
     <w:p>
       <w:pPr>
-        <w:jc w:val="left"/>
-        <w:bidi/>
+        <w:bidi w:val="1"/>
+        <w:jc w:val="start"/>
       </w:pPr>
       <w:r>
         <w:rPr>
-          <w:b w:val="0"/>
-          <w:rtl/>
+          <w:rFonts w:ascii="Noto Sans Arabic" w:hAnsi="Noto Sans Arabic" w:cs="Noto Sans Arabic" w:eastAsia="Noto Sans Arabic"/>
+          <w:sz w:val="22"/>
+          <w:szCs w:val="22"/>
+          <w:rtl w:val="1"/>
+          <w:lang w:bidi="ar-EG"/>
+          <w:color w:val="18394D"/>
+          <w:b w:val="1"/>
+          <w:bCs w:val="1"/>
         </w:rPr>
-        <w:t>٢. الاطلاع على التعليمات، ثم إدخال بيانات النشاط ورفع المستندات المطلوبة، مع إمكانية حفظ مسودة قبل الإرسال.</w:t>
+        <w:t xml:space="preserve">٢.  تسجيل النشاط:  </w:t>
+      </w:r>
+      <w:r>
+        <w:t>يملأ بيانات النشاط ويرفع المستندات، مع إمكانية حفظ مسودة ومراجعتها قبل الإرسال.</w:t>
       </w:r>
     </w:p>
     <w:p>
       <w:pPr>
-        <w:jc w:val="left"/>
-        <w:bidi/>
+        <w:bidi w:val="1"/>
+        <w:jc w:val="start"/>
       </w:pPr>
       <w:r>
         <w:rPr>
-          <w:b w:val="0"/>
-          <w:rtl/>
+          <w:rFonts w:ascii="Noto Sans Arabic" w:hAnsi="Noto Sans Arabic" w:cs="Noto Sans Arabic" w:eastAsia="Noto Sans Arabic"/>
+          <w:sz w:val="22"/>
+          <w:szCs w:val="22"/>
+          <w:rtl w:val="1"/>
+          <w:lang w:bidi="ar-EG"/>
+          <w:color w:val="18394D"/>
+          <w:b w:val="1"/>
+          <w:bCs w:val="1"/>
         </w:rPr>
-        <w:t>٣. مراجعة البيانات وتأكيد تقديم الطلب؛ يصدر النظام رقمًا للطلب ويحفظ النسخة المقدمة للمراجعة.</w:t>
+        <w:t xml:space="preserve">٣.  إصدار الاستمارة:  </w:t>
+      </w:r>
+      <w:r>
+        <w:t>بعد تأكيد التقديم، يحصل على رقم طلب واستمارة جاهزة للتنزيل والطباعة.</w:t>
       </w:r>
     </w:p>
     <w:p>
       <w:pPr>
-        <w:jc w:val="left"/>
-        <w:bidi/>
+        <w:bidi w:val="1"/>
+        <w:jc w:val="start"/>
       </w:pPr>
       <w:r>
         <w:rPr>
-          <w:b w:val="0"/>
-          <w:rtl/>
+          <w:rFonts w:ascii="Noto Sans Arabic" w:hAnsi="Noto Sans Arabic" w:cs="Noto Sans Arabic" w:eastAsia="Noto Sans Arabic"/>
+          <w:sz w:val="22"/>
+          <w:szCs w:val="22"/>
+          <w:rtl w:val="1"/>
+          <w:lang w:bidi="ar-EG"/>
+          <w:color w:val="18394D"/>
+          <w:b w:val="1"/>
+          <w:bCs w:val="1"/>
         </w:rPr>
-        <w:t>٤. تنزيل استمارة PDF جاهزة للطباعة، ثم طباعتها وتسليمها للمكتب الذي تحدده الكلية مع المستندات المطلوبة.</w:t>
+        <w:t xml:space="preserve">٤.  التسليم والمتابعة:  </w:t>
       </w:r>
-    </w:p>
-    <w:p>
-      <w:pPr>
-        <w:jc w:val="left"/>
-        <w:bidi/>
-      </w:pPr>
       <w:r>
-        <w:rPr>
-          <w:b w:val="0"/>
-          <w:rtl/>
-        </w:rPr>
-        <w:t>٥. متابعة حالة الطلب وملاحظات الموظف، واستكمال أي تعديلات مطلوبة من خلال الحساب.</w:t>
+        <w:t>يطبع الطالب الاستمارة ويسلمها للمكتب المختص، ويتابع أي ملاحظات أو تعديلات مطلوبة من حسابه.</w:t>
       </w:r>
     </w:p>
     <w:p>
       <w:pPr>
         <w:pStyle w:val="Heading2"/>
-        <w:jc w:val="left"/>
-        <w:bidi/>
+        <w:widowControl/>
+        <w:bidi w:val="1"/>
+        <w:jc w:val="start"/>
       </w:pPr>
       <w:r>
-        <w:rPr>
-          <w:b w:val="0"/>
-          <w:rtl/>
-        </w:rPr>
-        <w:t>٣. الاستمارة والحالة المعروضة للطالب</w:t>
+        <w:t>الاستمارة والدرجات</w:t>
       </w:r>
     </w:p>
     <w:p>
       <w:pPr>
-        <w:jc w:val="left"/>
-        <w:bidi/>
+        <w:widowControl/>
+        <w:bidi w:val="1"/>
+        <w:jc w:val="start"/>
       </w:pPr>
       <w:r>
-        <w:rPr>
-          <w:b w:val="0"/>
-          <w:rtl/>
-        </w:rPr>
-        <w:t>تُعد الاستمارة وفق قالب رسمي يتضمن هوية الجامعة والكلية، وبيانات الطالب والنشاط، ورقم الطلب وتاريخه، ومواضع التوقيعات المطلوبة. وتُحفظ نسختها داخل النظام للمطابقة وإعادة التنزيل، دون إضافة أختام أو توقيعات توحي باعتماد لم يحدث.</w:t>
+        <w:t>تُعد الاستمارة بقالب رسمي يتضمن شعار الجامعة والكلية، وبيانات الطالب والنشاط، ورقم الطلب وتاريخه، ومواضع التوقيعات المطلوبة. وتُحفظ نسخة منها للمراجعة وإعادة التنزيل.</w:t>
       </w:r>
     </w:p>
     <w:p>
       <w:pPr>
-        <w:jc w:val="left"/>
-        <w:bidi/>
+        <w:widowControl/>
+        <w:bidi w:val="1"/>
+        <w:jc w:val="start"/>
       </w:pPr>
       <w:r>
-        <w:rPr>
-          <w:b w:val="0"/>
-          <w:rtl/>
-        </w:rPr>
-        <w:t>تظهر الحالات بوضوح: «مسودة»، أو «بانتظار تسليم الاستمارة والمراجعة»، أو «مطلوب استكمال»، أو «لم يُعتمد»، أو «معتمد». وعند الاعتماد فقط تظهر عبارة «تم اعتماد نشاطك»، ويكتمل مؤشر الدرجة إلى ٤٠ / ٤٠ دون درجات جزئية أو احتساب مكرر.</w:t>
+        <w:t>يظل الطلب قيد المراجعة دون احتساب الدرجة. وبعد اعتماد الموظف تظهر رسالة «تم اعتماد نشاطك»، ويكتمل مؤشر الدرجة إلى ٤٠ / ٤٠. ولا تُحتسب درجات جزئية أو يُكرر الاستحقاق خلال الفترة المعتمدة.</w:t>
       </w:r>
     </w:p>
     <w:p>
@@ -250,202 +225,203 @@
     </w:p>
     <w:p>
       <w:pPr>
-        <w:pStyle w:val="Heading1"/>
-        <w:jc w:val="left"/>
-        <w:bidi/>
+        <w:widowControl/>
+        <w:bidi w:val="1"/>
+        <w:jc w:val="start"/>
       </w:pPr>
       <w:r>
         <w:rPr>
-          <w:b w:val="0"/>
-          <w:rtl/>
+          <w:rFonts w:ascii="Noto Sans Arabic" w:hAnsi="Noto Sans Arabic" w:cs="Noto Sans Arabic" w:eastAsia="Noto Sans Arabic"/>
+          <w:sz w:val="20"/>
+          <w:szCs w:val="20"/>
+          <w:rtl w:val="1"/>
+          <w:lang w:bidi="ar-EG"/>
+          <w:color w:val="246D75"/>
+          <w:b w:val="1"/>
+          <w:bCs w:val="1"/>
         </w:rPr>
-        <w:t>الحسابات والمراجعة والإدارة</w:t>
+        <w:t>التشغيل والصلاحيات  /  ٠٢</w:t>
+      </w:r>
+    </w:p>
+    <w:p>
+      <w:pPr>
+        <w:pStyle w:val="Title"/>
+        <w:widowControl/>
+        <w:bidi w:val="1"/>
+        <w:jc w:val="start"/>
+      </w:pPr>
+      <w:r>
+        <w:t>المراجعة وإدارة الحسابات</w:t>
       </w:r>
     </w:p>
     <w:p>
       <w:pPr>
         <w:pStyle w:val="Heading2"/>
-        <w:jc w:val="left"/>
-        <w:bidi/>
+        <w:widowControl/>
+        <w:bidi w:val="1"/>
+        <w:jc w:val="start"/>
       </w:pPr>
       <w:r>
-        <w:rPr>
-          <w:b w:val="0"/>
-          <w:rtl/>
-        </w:rPr>
-        <w:t>٤. لوحة الموظف وإجراءات المراجعة</w:t>
+        <w:t>لوحة الموظف المختص</w:t>
       </w:r>
     </w:p>
     <w:p>
       <w:pPr>
-        <w:jc w:val="left"/>
-        <w:bidi/>
+        <w:widowControl/>
+        <w:bidi w:val="1"/>
+        <w:jc w:val="start"/>
       </w:pPr>
       <w:r>
-        <w:rPr>
-          <w:b w:val="0"/>
-          <w:rtl/>
-        </w:rPr>
-        <w:t>بعد دخول الموظف بحسابه، يظهر له مدخل لوحة الإدارة داخل واجهة الموقع. ويبحث عن الطالب بالرقم الجامعي المدون على الكارنيه باعتباره المعرف الأساسي، مع إتاحة البحث بالاسم أو الرقم القومي وفق البيانات والصلاحيات المعتمدة، وإظهار ما يكفي للتمييز بين الأسماء المتشابهة.</w:t>
+        <w:t>بعد تسجيل الدخول، يظهر للموظف مدخل لوحة الإدارة. ويبحث عن الطالب بالرقم الجامعي الموجود على الكارنيه أساسًا، أو بالاسم أو الرقم القومي وفق الصلاحيات، ثم يفتح الطلب ويطّلع على بياناته ومرفقاته واستمارتِه.</w:t>
       </w:r>
     </w:p>
     <w:p>
       <w:pPr>
-        <w:jc w:val="left"/>
-        <w:bidi/>
+        <w:widowControl/>
+        <w:bidi w:val="1"/>
+        <w:jc w:val="start"/>
       </w:pPr>
       <w:r>
-        <w:rPr>
-          <w:b w:val="0"/>
-          <w:rtl/>
-        </w:rPr>
-        <w:t>تُعرض بيانات الطلب والمرفقات والاستمارة والحالة الحالية. وبعد استلام الورق ومطابقته، يختار الموظف اعتماد النشاط وإضافة الدرجة، أو طلب استكمال مع توضيح المطلوب، أو عدم الاعتماد مع بيان السبب. وتنعكس نتيجة المراجعة في حساب الطالب.</w:t>
+        <w:t>بعد استلام الورق ومطابقته، يختار الموظف «اعتماد النشاط»، أو «طلب استكمال»، أو «عدم الاعتماد» مع توضيح السبب. وتظهر النتيجة للطالب مباشرة داخل حسابه.</w:t>
       </w:r>
     </w:p>
     <w:p>
       <w:pPr>
-        <w:jc w:val="left"/>
-        <w:bidi/>
+        <w:widowControl/>
+        <w:bidi w:val="1"/>
+        <w:jc w:val="start"/>
       </w:pPr>
       <w:r>
-        <w:rPr>
-          <w:b w:val="0"/>
-          <w:rtl/>
-        </w:rPr>
-        <w:t>تُوثق الإجراءات باسم منفذها وتاريخها. ويُضبط الإلغاء أو الأرشفة وفق الصلاحيات، مع تقييد الحذف النهائي وسحب اعتماد الطلبات. وإذا سُحب اعتماد سابق، تُحدَّث الدرجة تلقائيًا ويُحفظ سبب الإجراء. ولا يتضمن النطاق الحالي رمز QR؛ يعتمد الوصول إلى الطلب على البحث.</w:t>
+        <w:t>تُسجل إجراءات المراجعة باسم منفذها وتاريخها. ويُتاح الإلغاء أو الأرشفة وفق الصلاحيات، مع تقييد الحذف النهائي وسحب الاعتماد. وإذا سُحب اعتماد سابق تُحدَّث الدرجة مع حفظ سبب الإجراء.</w:t>
       </w:r>
     </w:p>
     <w:p>
       <w:pPr>
         <w:pStyle w:val="Heading2"/>
-        <w:jc w:val="left"/>
-        <w:bidi/>
+        <w:widowControl/>
+        <w:bidi w:val="1"/>
+        <w:jc w:val="start"/>
       </w:pPr>
       <w:r>
-        <w:rPr>
-          <w:b w:val="0"/>
-          <w:rtl/>
-        </w:rPr>
-        <w:t>٥. مستويات الصلاحيات</w:t>
+        <w:t>ثلاثة مستويات للحسابات</w:t>
       </w:r>
     </w:p>
     <w:p>
       <w:pPr>
-        <w:jc w:val="left"/>
-        <w:bidi/>
+        <w:bidi w:val="1"/>
+        <w:jc w:val="start"/>
       </w:pPr>
       <w:r>
         <w:rPr>
-          <w:b w:val="0"/>
-          <w:rtl/>
+          <w:rFonts w:ascii="Noto Sans Arabic" w:hAnsi="Noto Sans Arabic" w:cs="Noto Sans Arabic" w:eastAsia="Noto Sans Arabic"/>
+          <w:sz w:val="22"/>
+          <w:szCs w:val="22"/>
+          <w:rtl w:val="1"/>
+          <w:lang w:bidi="ar-EG"/>
+          <w:color w:val="18394D"/>
+          <w:b w:val="1"/>
+          <w:bCs w:val="1"/>
         </w:rPr>
-        <w:t>•  الطالب: إدارة طلبه الشخصي ومرفقاته، وتنزيل الاستمارة، ومتابعة الحالة والملاحظات، دون الاطلاع على بيانات غيره.</w:t>
+        <w:t xml:space="preserve">١.  الطالب:  </w:t>
+      </w:r>
+      <w:r>
+        <w:t>تقديم طلبه وتنزيل الاستمارة ومتابعة الحالة واستكمال الملاحظات، دون الوصول إلى بيانات الآخرين.</w:t>
       </w:r>
     </w:p>
     <w:p>
       <w:pPr>
-        <w:jc w:val="left"/>
-        <w:bidi/>
+        <w:bidi w:val="1"/>
+        <w:jc w:val="start"/>
       </w:pPr>
       <w:r>
         <w:rPr>
-          <w:b w:val="0"/>
-          <w:rtl/>
+          <w:rFonts w:ascii="Noto Sans Arabic" w:hAnsi="Noto Sans Arabic" w:cs="Noto Sans Arabic" w:eastAsia="Noto Sans Arabic"/>
+          <w:sz w:val="22"/>
+          <w:szCs w:val="22"/>
+          <w:rtl w:val="1"/>
+          <w:lang w:bidi="ar-EG"/>
+          <w:color w:val="18394D"/>
+          <w:b w:val="1"/>
+          <w:bCs w:val="1"/>
         </w:rPr>
-        <w:t>•  الموظف المختص: البحث والمراجعة والاعتماد وطلب التعديل والإلغاء بحسب صلاحياته، دون إضافة حسابات إدارية.</w:t>
+        <w:t xml:space="preserve">٢.  الموظف:  </w:t>
+      </w:r>
+      <w:r>
+        <w:t>البحث والمراجعة واتخاذ القرار في الطلبات وفق صلاحياته، دون إنشاء حسابات إدارية.</w:t>
       </w:r>
     </w:p>
     <w:p>
       <w:pPr>
-        <w:jc w:val="left"/>
-        <w:bidi/>
+        <w:bidi w:val="1"/>
+        <w:jc w:val="start"/>
       </w:pPr>
       <w:r>
         <w:rPr>
-          <w:b w:val="0"/>
-          <w:rtl/>
+          <w:rFonts w:ascii="Noto Sans Arabic" w:hAnsi="Noto Sans Arabic" w:cs="Noto Sans Arabic" w:eastAsia="Noto Sans Arabic"/>
+          <w:sz w:val="22"/>
+          <w:szCs w:val="22"/>
+          <w:rtl w:val="1"/>
+          <w:lang w:bidi="ar-EG"/>
+          <w:color w:val="18394D"/>
+          <w:b w:val="1"/>
+          <w:bCs w:val="1"/>
         </w:rPr>
-        <w:t>•  المسؤول الرئيسي: إدارة حسابات الموظفين وإضافتها وتعطيلها وتحديد صلاحياتها، إلى جانب صلاحيات المراجعة.</w:t>
+        <w:t xml:space="preserve">٣.  المسؤول الرئيسي:  </w:t>
       </w:r>
-    </w:p>
-    <w:p>
-      <w:pPr>
-        <w:jc w:val="left"/>
-        <w:bidi/>
-      </w:pPr>
       <w:r>
-        <w:rPr>
-          <w:b w:val="0"/>
-          <w:rtl/>
-        </w:rPr>
-        <w:t>يُجهز الحساب الرئيسي الأول أثناء التهيئة والتسليم. وتُطبق الصلاحيات على الخادم، وليس بمجرد إظهار الأزرار أو إخفائها، مع منع تكرار حساب الطالب أو تقديم طلب باسم طالب آخر.</w:t>
+        <w:t>إضافة الموظفين وتعطيل حساباتهم وإدارة صلاحياتهم، إلى جانب أعمال المراجعة.</w:t>
       </w:r>
     </w:p>
     <w:p>
       <w:pPr>
         <w:pStyle w:val="Heading2"/>
-        <w:jc w:val="left"/>
-        <w:bidi/>
+        <w:widowControl/>
+        <w:bidi w:val="1"/>
+        <w:jc w:val="start"/>
       </w:pPr>
       <w:r>
-        <w:rPr>
-          <w:b w:val="0"/>
-          <w:rtl/>
-        </w:rPr>
-        <w:t>٦. تسجيل الدخول والتحقق من الهوية</w:t>
+        <w:t>طريقة تسجيل الدخول</w:t>
       </w:r>
     </w:p>
     <w:p>
       <w:pPr>
-        <w:jc w:val="left"/>
-        <w:bidi/>
+        <w:widowControl/>
+        <w:bidi w:val="1"/>
+        <w:jc w:val="start"/>
       </w:pPr>
       <w:r>
-        <w:rPr>
-          <w:b w:val="0"/>
-          <w:rtl/>
-        </w:rPr>
-        <w:t>يُحدد أسلوب الدخول مع تقنية المعلومات. والأولوية للربط الرسمي بحسابات الجامعة إن كان متاحًا. ويمكن استخدام Google ببريد الجامعة مع التحقق من الكلية، أو بحساب شخصي مرتبط بسجل طالب رسمي من خلال وسيلة تحقق تعتمدها الجامعة.</w:t>
+        <w:t>تُحدد مع تقنية المعلومات: إما الربط الرسمي بحسابات الجامعة، أو الدخول بواسطة Google مع ربط الحساب بسجل طالب موثَّق. ويُتحقق من انتماء المستخدم لكلية التجارة؛ فحساب Google الشخصي وحده لا يثبت صفة الطالب.</w:t>
       </w:r>
     </w:p>
     <w:p>
       <w:pPr>
-        <w:jc w:val="left"/>
-        <w:bidi/>
+        <w:widowControl/>
+        <w:bidi w:val="1"/>
+        <w:jc w:val="start"/>
       </w:pPr>
       <w:r>
-        <w:rPr>
-          <w:b w:val="0"/>
-          <w:rtl/>
-        </w:rPr>
-        <w:t>تسجيل الدخول بحساب Google شخصي وحده لا يثبت صفة الطالب، كما لا يُستخدم الرقم الجامعي أو الرقم القومي وحده كوسيلة دخول. ويشمل الإعداد تنظيم تفعيل الحسابات واستردادها وتصحيح البيانات الرسمية.</w:t>
+        <w:t>تُطبق الصلاحيات داخل النظام، وتُضبط آليات تفعيل الحسابات واستردادها، مع حماية بيانات الهوية من التعديل غير المصرح به.</w:t>
       </w:r>
     </w:p>
     <w:p>
       <w:pPr>
         <w:pStyle w:val="Heading2"/>
-        <w:jc w:val="left"/>
-        <w:bidi/>
+        <w:widowControl/>
+        <w:bidi w:val="1"/>
+        <w:jc w:val="start"/>
       </w:pPr>
       <w:r>
-        <w:rPr>
-          <w:b w:val="0"/>
-          <w:rtl/>
-        </w:rPr>
-        <w:t>٧. المساعدة الذكية</w:t>
+        <w:t>دور المساعد الذكي</w:t>
       </w:r>
     </w:p>
     <w:p>
       <w:pPr>
-        <w:jc w:val="left"/>
-        <w:bidi/>
+        <w:widowControl/>
+        <w:bidi w:val="1"/>
+        <w:jc w:val="start"/>
       </w:pPr>
       <w:r>
-        <w:rPr>
-          <w:b w:val="0"/>
-          <w:rtl/>
-        </w:rPr>
-        <w:t>تُنشأ الاستمارة بقالب برمجي ثابت لضمان دقة الحقول والطباعة. ويمكن توظيف الذكاء الاصطناعي لقراءة المستندات واقتراح تعبئة البيانات أو صياغة وصف النشاط والتنبيه إلى النواقص، على أن يراجع الطالب المقترحات. ويظل اعتماد النشاط ومنح الدرجة للموظف المختص؛ ويُحسم مكان تشغيل المساعد بعد تقييم الموارد والخصوصية والدقة.</w:t>
+        <w:t>يمكن للمساعد قراءة بيانات المستندات واقتراح تعبئة الحقول وصياغة وصف النشاط والتنبيه إلى النواقص، مع مراجعة الطالب قبل الإرسال. أما الاستمارة فتُنتج بقالب ثابت لضمان دقة التنسيق، ويظل اعتماد النشاط ومنح الدرجة من اختصاص الموظف. ويُحدد مكان تشغيل المساعد بعد تقييم الدقة والموارد وحماية البيانات.</w:t>
       </w:r>
     </w:p>
     <w:p>
@@ -455,221 +431,234 @@
     </w:p>
     <w:p>
       <w:pPr>
-        <w:pStyle w:val="Heading1"/>
-        <w:jc w:val="left"/>
-        <w:bidi/>
+        <w:widowControl/>
+        <w:bidi w:val="1"/>
+        <w:jc w:val="start"/>
       </w:pPr>
       <w:r>
         <w:rPr>
-          <w:b w:val="0"/>
-          <w:rtl/>
+          <w:rFonts w:ascii="Noto Sans Arabic" w:hAnsi="Noto Sans Arabic" w:cs="Noto Sans Arabic" w:eastAsia="Noto Sans Arabic"/>
+          <w:sz w:val="20"/>
+          <w:szCs w:val="20"/>
+          <w:rtl w:val="1"/>
+          <w:lang w:bidi="ar-EG"/>
+          <w:color w:val="246D75"/>
+          <w:b w:val="1"/>
+          <w:bCs w:val="1"/>
         </w:rPr>
+        <w:t>خطة العمل  /  ٠٣</w:t>
+      </w:r>
+    </w:p>
+    <w:p>
+      <w:pPr>
+        <w:pStyle w:val="Title"/>
+        <w:widowControl/>
+        <w:bidi w:val="1"/>
+        <w:jc w:val="start"/>
+      </w:pPr>
+      <w:r>
         <w:t>التنفيذ والاختبار والتعميم</w:t>
       </w:r>
     </w:p>
     <w:p>
       <w:pPr>
         <w:pStyle w:val="Heading2"/>
-        <w:jc w:val="left"/>
-        <w:bidi/>
+        <w:widowControl/>
+        <w:bidi w:val="1"/>
+        <w:jc w:val="start"/>
       </w:pPr>
       <w:r>
-        <w:rPr>
-          <w:b w:val="0"/>
-          <w:rtl/>
-        </w:rPr>
-        <w:t>٨. مراحل التنفيذ والمخرجات</w:t>
+        <w:t>مراحل التنفيذ</w:t>
       </w:r>
     </w:p>
     <w:p>
       <w:pPr>
-        <w:jc w:val="left"/>
-        <w:bidi/>
+        <w:bidi w:val="1"/>
+        <w:jc w:val="start"/>
       </w:pPr>
       <w:r>
         <w:rPr>
-          <w:b w:val="0"/>
-          <w:rtl/>
+          <w:rFonts w:ascii="Noto Sans Arabic" w:hAnsi="Noto Sans Arabic" w:cs="Noto Sans Arabic" w:eastAsia="Noto Sans Arabic"/>
+          <w:sz w:val="22"/>
+          <w:szCs w:val="22"/>
+          <w:rtl w:val="1"/>
+          <w:lang w:bidi="ar-EG"/>
+          <w:color w:val="18394D"/>
+          <w:b w:val="1"/>
+          <w:bCs w:val="1"/>
         </w:rPr>
-        <w:t>المرحلة الأولى — تثبيت المتطلبات: تحديد الاستمارة والحقول والأنشطة المقبولة وقواعد الاستحقاق والصلاحيات؛ والمخرج وصف عمل واضح ونموذج بيانات معتمد.</w:t>
+        <w:t xml:space="preserve">١.  تحديد المتطلبات:  </w:t>
+      </w:r>
+      <w:r>
+        <w:t>تثبيت نموذج الاستمارة والبيانات والمستندات وقواعد الاستحقاق والصلاحيات، وتحديد طريقة الدخول والجهة التقنية المسؤولة.</w:t>
       </w:r>
     </w:p>
     <w:p>
       <w:pPr>
-        <w:jc w:val="left"/>
-        <w:bidi/>
+        <w:bidi w:val="1"/>
+        <w:jc w:val="start"/>
       </w:pPr>
       <w:r>
         <w:rPr>
-          <w:b w:val="0"/>
-          <w:rtl/>
+          <w:rFonts w:ascii="Noto Sans Arabic" w:hAnsi="Noto Sans Arabic" w:cs="Noto Sans Arabic" w:eastAsia="Noto Sans Arabic"/>
+          <w:sz w:val="22"/>
+          <w:szCs w:val="22"/>
+          <w:rtl w:val="1"/>
+          <w:lang w:bidi="ar-EG"/>
+          <w:color w:val="18394D"/>
+          <w:b w:val="1"/>
+          <w:bCs w:val="1"/>
         </w:rPr>
-        <w:t>المرحلة الثانية — تصميم الواجهات: إعداد شاشات الطالب والمراجعة والإدارة بهوية كلية التجارة، مع مراعاة وضوح العربية وسهولة الاستخدام على الهاتف والكمبيوتر.</w:t>
+        <w:t xml:space="preserve">٢.  تصميم الواجهات:  </w:t>
+      </w:r>
+      <w:r>
+        <w:t>إعداد شاشات الطالب والموظف والمسؤول الرئيسي بهوية الكلية، مع مراعاة وضوح العربية وسهولة الاستخدام على الهاتف والكمبيوتر.</w:t>
       </w:r>
     </w:p>
     <w:p>
       <w:pPr>
-        <w:jc w:val="left"/>
-        <w:bidi/>
+        <w:bidi w:val="1"/>
+        <w:jc w:val="start"/>
       </w:pPr>
       <w:r>
         <w:rPr>
-          <w:b w:val="0"/>
-          <w:rtl/>
+          <w:rFonts w:ascii="Noto Sans Arabic" w:hAnsi="Noto Sans Arabic" w:cs="Noto Sans Arabic" w:eastAsia="Noto Sans Arabic"/>
+          <w:sz w:val="22"/>
+          <w:szCs w:val="22"/>
+          <w:rtl w:val="1"/>
+          <w:lang w:bidi="ar-EG"/>
+          <w:color w:val="18394D"/>
+          <w:b w:val="1"/>
+          <w:bCs w:val="1"/>
         </w:rPr>
-        <w:t>المرحلة الثالثة — التطوير: تنفيذ الحسابات والطلبات والمرفقات والاستمارة والمراجعة واحتساب الدرجة وسجل الإجراءات، باستخدام بيانات تجريبية أولًا.</w:t>
+        <w:t xml:space="preserve">٣.  التطوير:  </w:t>
+      </w:r>
+      <w:r>
+        <w:t>تنفيذ الحسابات والطلبات والمرفقات والاستمارة والمراجعة والدرجات وسجل الإجراءات، وتجربة الوظائف ببيانات اختبار.</w:t>
       </w:r>
     </w:p>
     <w:p>
       <w:pPr>
-        <w:jc w:val="left"/>
-        <w:bidi/>
+        <w:bidi w:val="1"/>
+        <w:jc w:val="start"/>
       </w:pPr>
       <w:r>
         <w:rPr>
-          <w:b w:val="0"/>
-          <w:rtl/>
+          <w:rFonts w:ascii="Noto Sans Arabic" w:hAnsi="Noto Sans Arabic" w:cs="Noto Sans Arabic" w:eastAsia="Noto Sans Arabic"/>
+          <w:sz w:val="22"/>
+          <w:szCs w:val="22"/>
+          <w:rtl w:val="1"/>
+          <w:lang w:bidi="ar-EG"/>
+          <w:color w:val="18394D"/>
+          <w:b w:val="1"/>
+          <w:bCs w:val="1"/>
         </w:rPr>
-        <w:t>المرحلة الرابعة — التجربة والاختبار: تجربة دورة العمل مع ممثلين عن الطلاب والموظفين، وفحص الصلاحيات والطباعة والاستخدام المتزامن والنسخ الاحتياطي والاسترجاع، ثم معالجة الملاحظات.</w:t>
+        <w:t xml:space="preserve">٤.  التجربة والتسليم:  </w:t>
+      </w:r>
+      <w:r>
+        <w:t>اختبار دورة العمل مع الطلاب والموظفين ومعالجة الملاحظات، ثم تجهيز الحسابات وتدريب الموظفين وتسليم دليل التشغيل.</w:t>
       </w:r>
     </w:p>
     <w:p>
       <w:pPr>
-        <w:jc w:val="left"/>
-        <w:bidi/>
+        <w:bidi w:val="1"/>
+        <w:jc w:val="start"/>
       </w:pPr>
       <w:r>
         <w:rPr>
-          <w:b w:val="0"/>
-          <w:rtl/>
+          <w:rFonts w:ascii="Noto Sans Arabic" w:hAnsi="Noto Sans Arabic" w:cs="Noto Sans Arabic" w:eastAsia="Noto Sans Arabic"/>
+          <w:sz w:val="22"/>
+          <w:szCs w:val="22"/>
+          <w:rtl w:val="1"/>
+          <w:lang w:bidi="ar-EG"/>
+          <w:color w:val="18394D"/>
+          <w:b w:val="1"/>
+          <w:bCs w:val="1"/>
         </w:rPr>
-        <w:t>المرحلة الخامسة — التشغيل والتسليم: تجهيز الحسابات والبيانات، وتدريب الموظفين، وتسليم دليل التشغيل، بعد استيفاء معايير القبول المتفق عليها.</w:t>
+        <w:t xml:space="preserve">٥.  التعميم:  </w:t>
       </w:r>
-    </w:p>
-    <w:p>
-      <w:pPr>
-        <w:jc w:val="left"/>
-        <w:bidi/>
-      </w:pPr>
       <w:r>
-        <w:rPr>
-          <w:b w:val="0"/>
-          <w:rtl/>
-        </w:rPr>
-        <w:t>المرحلة السادسة — التعميم: إنشاء نسخة مستقلة لكل كلية من الإصدار المستقر، وتخصيص هويتها وطلابها وموظفيها، واختبارها قبل تشغيلها.</w:t>
+        <w:t>إنشاء نسخة مستقلة لكل كلية من الإصدار المستقر، وتخصيص اسمها وشعارها وطلابها وموظفيها، واختبارها قبل تشغيلها.</w:t>
       </w:r>
     </w:p>
     <w:p>
       <w:pPr>
         <w:pStyle w:val="Heading2"/>
-        <w:jc w:val="left"/>
-        <w:bidi/>
+        <w:widowControl/>
+        <w:bidi w:val="1"/>
+        <w:jc w:val="start"/>
       </w:pPr>
       <w:r>
-        <w:rPr>
-          <w:b w:val="0"/>
-          <w:rtl/>
-        </w:rPr>
-        <w:t>٩. الربط المركزي وحماية البيانات</w:t>
+        <w:t>الربط بالجامعة وحماية البيانات</w:t>
       </w:r>
     </w:p>
     <w:p>
       <w:pPr>
-        <w:jc w:val="left"/>
-        <w:bidi/>
+        <w:widowControl/>
+        <w:bidi w:val="1"/>
+        <w:jc w:val="start"/>
       </w:pPr>
       <w:r>
-        <w:rPr>
-          <w:b w:val="0"/>
-          <w:rtl/>
-        </w:rPr>
-        <w:t>تظل المواقع مستقلة لكل كلية، مع ربطها بسيرفرات الجامعة وفق الآلية التي تتيحها تقنية المعلومات. ويُحدد مصدر بيانات الطلاب، ومكان تخزين الطلبات والمرفقات، وطريقة إرسال الاعتماد والدرجات، والتعامل مع انقطاع الاتصال ومنع تكرار السجلات. ويُختبر الربط فعليًا قبل اعتباره جاهزًا.</w:t>
+        <w:t>تُربط المواقع بسيرفرات الجامعة الرئيسية وفق الآلية الرسمية المتاحة. ويُحدد مصدر بيانات الطلاب، ومكان حفظ الطلبات والمرفقات، وطريقة إرسال الاعتماد والدرجات، وآلية معالجة انقطاع الاتصال ومنع تكرار السجلات.</w:t>
       </w:r>
     </w:p>
     <w:p>
       <w:pPr>
-        <w:jc w:val="left"/>
-        <w:bidi/>
+        <w:widowControl/>
+        <w:bidi w:val="1"/>
+        <w:jc w:val="start"/>
       </w:pPr>
       <w:r>
-        <w:rPr>
-          <w:b w:val="0"/>
-          <w:rtl/>
-        </w:rPr>
-        <w:t>تشمل الضوابط حماية الاتصال والملفات، وفصل صلاحيات الوصول، وتقليل البيانات المجمعة، وتحديد أنواع المرفقات وأحجامها، وحفظ نسخ احتياطية واختبار استعادتها. ولا تُنقل مستندات الطلاب إلى خدمات ذكاء اصطناعي خارجية دون اعتماد الجهة المختصة.</w:t>
+        <w:t>يشمل التنفيذ حماية الوصول إلى الملفات والبيانات، وفصل صلاحيات الكليات، وتسجيل العمليات المهمة، والنسخ الاحتياطي واختبار الاسترجاع. ويُحفظ إصدار مرجعي للمشروع لتسهيل تحديث النسخ لاحقًا.</w:t>
       </w:r>
     </w:p>
     <w:p>
       <w:pPr>
         <w:pStyle w:val="Heading2"/>
-        <w:jc w:val="left"/>
-        <w:bidi/>
+        <w:widowControl/>
+        <w:bidi w:val="1"/>
+        <w:jc w:val="start"/>
       </w:pPr>
       <w:r>
-        <w:rPr>
-          <w:b w:val="0"/>
-          <w:rtl/>
-        </w:rPr>
-        <w:t>١٠. متطلبات استكمال العمل ومعايير الجاهزية</w:t>
+        <w:t>ما يلزم تحديده لاستكمال العمل</w:t>
       </w:r>
     </w:p>
     <w:p>
       <w:pPr>
-        <w:jc w:val="left"/>
-        <w:bidi/>
+        <w:widowControl/>
+        <w:bidi w:val="1"/>
+        <w:jc w:val="start"/>
       </w:pPr>
       <w:r>
-        <w:rPr>
-          <w:b w:val="0"/>
-          <w:rtl/>
-        </w:rPr>
-        <w:t>يلزم توفير نموذج الاستمارة والشعارات الرسمية، وتحديد الأنشطة والمستندات المطلوبة، والفترة الدراسية لاستحقاق الدرجة، ومكتب التسليم، والموظفين والمسؤول الرئيسي، إلى جانب اختيار طريقة الدخول وتسمية جهة التنسيق التقني وتحديد الاستضافة وسياسة الاحتفاظ بالبيانات.</w:t>
+        <w:t>نموذج الاستمارة والشعارات الرسمية، والأنشطة والمستندات المقبولة، والفترة الدراسية لاستحقاق الأربعين درجة، ومكتب التسليم، والموظفون والمسؤول الرئيسي، وطريقة الدخول والاستضافة والربط مع الجامعة.</w:t>
       </w:r>
     </w:p>
     <w:p>
       <w:pPr>
-        <w:jc w:val="left"/>
-        <w:bidi/>
+        <w:pStyle w:val="Heading2"/>
+        <w:widowControl/>
+        <w:bidi w:val="1"/>
+        <w:jc w:val="start"/>
       </w:pPr>
       <w:r>
-        <w:rPr>
-          <w:b w:val="0"/>
-          <w:rtl/>
-        </w:rPr>
-        <w:t>تُعتمد جاهزية النسخة بعد نجاح دورة التقديم والمراجعة، وصحة الاستمارة والدرجة، ومنع تجاوز الصلاحيات والتكرار، واجتياز الاختبارات المطلوبة. وتُحدد خطة المواعيد والموارد بعد حسم المتطلبات الفنية والإدارية، ويُتخذ قرار التعميم بناءً على نتائج تجربة كلية التجارة.</w:t>
+        <w:t>معايير الجاهزية للتشغيل</w:t>
       </w:r>
     </w:p>
     <w:p>
       <w:pPr>
-        <w:jc w:val="left"/>
-        <w:bidi/>
+        <w:widowControl/>
+        <w:bidi w:val="1"/>
+        <w:jc w:val="start"/>
       </w:pPr>
       <w:r>
-        <w:rPr>
-          <w:b w:val="0"/>
-          <w:rtl/>
-        </w:rPr>
-        <w:t>ملاحظات سيادتكم: ........................................................................................</w:t>
-      </w:r>
-    </w:p>
-    <w:p>
-      <w:pPr>
-        <w:jc w:val="left"/>
-        <w:bidi/>
-      </w:pPr>
-      <w:r>
-        <w:rPr>
-          <w:b w:val="0"/>
-          <w:rtl/>
-        </w:rPr>
-        <w:t>....................................................................................................................</w:t>
+        <w:t>بعد نجاح دورة التقديم والاعتماد، وصحة الاستمارة والدرجة، ومنع تكرار الاستحقاق وتجاوز الصلاحيات، واجتياز اختبارات الاستخدام المتزامن والنسخ الاحتياطي والاسترجاع. ويُختبر الربط المركزي فعليًا قبل اعتماده، وتُحدد المواعيد والموارد بعد حسم المتطلبات.</w:t>
       </w:r>
     </w:p>
     <w:sectPr>
       <w:headerReference w:type="default" r:id="rId9"/>
       <w:footerReference w:type="default" r:id="rId10"/>
       <w:pgSz w:w="11906" w:h="16838"/>
-      <w:pgMar w:top="1020" w:right="1134" w:bottom="964" w:left="1134" w:header="397" w:footer="397" w:gutter="0"/>
+      <w:pgMar w:top="1077" w:right="1191" w:bottom="1020" w:left="1191" w:header="425" w:footer="397" w:gutter="0"/>
       <w:cols w:space="720"/>
       <w:docGrid w:linePitch="360"/>
     </w:sectPr>
@@ -682,14 +671,19 @@
   <w:p>
     <w:pPr>
       <w:pStyle w:val="Footer"/>
-      <w:jc w:val="left"/>
-      <w:bidi/>
+      <w:bidi w:val="1"/>
+      <w:jc w:val="start"/>
     </w:pPr>
     <w:r>
       <w:rPr>
-        <w:sz w:val="18"/>
-      </w:rPr>
-      <w:t xml:space="preserve">عرض تنفيذي للمراجعة  •  ٢٥ أكتوبر ٢٠٢٦                         صفحة </w:t>
+        <w:rFonts w:ascii="Noto Sans Arabic" w:hAnsi="Noto Sans Arabic" w:cs="Noto Sans Arabic" w:eastAsia="Noto Sans Arabic"/>
+        <w:sz w:val="16"/>
+        <w:szCs w:val="16"/>
+        <w:rtl w:val="1"/>
+        <w:lang w:bidi="ar-EG"/>
+        <w:color w:val="637481"/>
+      </w:rPr>
+      <w:t xml:space="preserve">عرض تنفيذي  •  ٢٥ أكتوبر ٢٠٢٦     |     </w:t>
     </w:r>
     <w:fldSimple w:instr="PAGE"/>
   </w:p>
@@ -701,15 +695,22 @@
   <w:p>
     <w:pPr>
       <w:pStyle w:val="Header"/>
-      <w:jc w:val="left"/>
-      <w:bidi/>
+      <w:bidi w:val="1"/>
+      <w:jc w:val="start"/>
+      <w:pBdr>
+        <w:bottom w:val="single" w:sz="6" w:space="7" w:color="CBD8DE"/>
+      </w:pBdr>
     </w:pPr>
     <w:r>
       <w:rPr>
-        <w:color w:val="64748B"/>
-        <w:sz w:val="18"/>
-      </w:rPr>
-      <w:t>كلية التجارة  |  منظومة تسجيل النشاط الطلابي واعتماده</w:t>
+        <w:rFonts w:ascii="Noto Sans Arabic" w:hAnsi="Noto Sans Arabic" w:cs="Noto Sans Arabic" w:eastAsia="Noto Sans Arabic"/>
+        <w:sz w:val="17"/>
+        <w:szCs w:val="17"/>
+        <w:rtl w:val="1"/>
+        <w:lang w:bidi="ar-EG"/>
+        <w:color w:val="637481"/>
+      </w:rPr>
+      <w:t>كلية التجارة  /  منظومة النشاط الطلابي</w:t>
     </w:r>
   </w:p>
 </w:hdr>
@@ -1079,11 +1080,15 @@
     <w:qFormat/>
     <w:rsid w:val="00FC693F"/>
     <w:pPr>
-      <w:spacing w:after="120" w:line="269" w:lineRule="auto"/>
+      <w:spacing w:line="380" w:lineRule="exact" w:after="140"/>
     </w:pPr>
     <w:rPr>
-      <w:rFonts w:ascii="Noto Naskh Arabic" w:hAnsi="Noto Naskh Arabic" w:cs="Noto Naskh Arabic"/>
-      <w:sz w:val="24"/>
+      <w:rFonts w:ascii="Noto Sans Arabic" w:hAnsi="Noto Sans Arabic" w:cs="Noto Sans Arabic" w:eastAsia="Noto Sans Arabic"/>
+      <w:sz w:val="22"/>
+      <w:szCs w:val="22"/>
+      <w:rtl w:val="1"/>
+      <w:lang w:bidi="ar-EG"/>
+      <w:color w:val="24313B"/>
     </w:rPr>
   </w:style>
   <w:style w:type="paragraph" w:styleId="Header">
@@ -1141,16 +1146,24 @@
     <w:pPr>
       <w:keepNext/>
       <w:keepLines/>
-      <w:spacing w:before="160" w:after="140"/>
+      <w:spacing w:before="200" w:after="120" w:line="460" w:lineRule="exact"/>
       <w:outlineLvl w:val="0"/>
     </w:pPr>
     <w:rPr>
-      <w:rFonts w:asciiTheme="majorHAnsi" w:eastAsiaTheme="majorEastAsia" w:hAnsiTheme="majorHAnsi" w:cstheme="majorBidi" w:ascii="Noto Naskh Arabic" w:hAnsi="Noto Naskh Arabic" w:cs="Noto Naskh Arabic"/>
+      <w:rFonts w:asciiTheme="majorHAnsi" w:eastAsiaTheme="majorEastAsia" w:hAnsiTheme="majorHAnsi" w:cstheme="majorBidi"/>
       <w:b/>
       <w:bCs/>
-      <w:color w:val="16334A"/>
-      <w:sz w:val="38"/>
+      <w:color w:val="365F91" w:themeColor="accent1" w:themeShade="BF"/>
+      <w:sz w:val="28"/>
       <w:szCs w:val="28"/>
+      <w:rFonts w:ascii="Noto Sans Arabic" w:hAnsi="Noto Sans Arabic" w:cs="Noto Sans Arabic" w:eastAsia="Noto Sans Arabic"/>
+      <w:sz w:val="36"/>
+      <w:szCs w:val="36"/>
+      <w:rtl w:val="1"/>
+      <w:lang w:bidi="ar-EG"/>
+      <w:color w:val="18394D"/>
+      <w:b w:val="1"/>
+      <w:bCs w:val="1"/>
     </w:rPr>
   </w:style>
   <w:style w:type="paragraph" w:styleId="Heading2">
@@ -1165,16 +1178,24 @@
     <w:pPr>
       <w:keepNext/>
       <w:keepLines/>
-      <w:spacing w:before="160" w:after="140"/>
+      <w:spacing w:before="200" w:after="120" w:line="460" w:lineRule="exact"/>
       <w:outlineLvl w:val="1"/>
     </w:pPr>
     <w:rPr>
-      <w:rFonts w:asciiTheme="majorHAnsi" w:eastAsiaTheme="majorEastAsia" w:hAnsiTheme="majorHAnsi" w:cstheme="majorBidi" w:ascii="Noto Naskh Arabic" w:hAnsi="Noto Naskh Arabic" w:cs="Noto Naskh Arabic"/>
+      <w:rFonts w:asciiTheme="majorHAnsi" w:eastAsiaTheme="majorEastAsia" w:hAnsiTheme="majorHAnsi" w:cstheme="majorBidi"/>
       <w:b/>
       <w:bCs/>
-      <w:color w:val="16334A"/>
-      <w:sz w:val="28"/>
+      <w:color w:val="4F81BD" w:themeColor="accent1"/>
+      <w:sz w:val="26"/>
       <w:szCs w:val="26"/>
+      <w:rFonts w:ascii="Noto Sans Arabic" w:hAnsi="Noto Sans Arabic" w:cs="Noto Sans Arabic" w:eastAsia="Noto Sans Arabic"/>
+      <w:sz w:val="26"/>
+      <w:szCs w:val="26"/>
+      <w:rtl w:val="1"/>
+      <w:lang w:bidi="ar-EG"/>
+      <w:color w:val="18394D"/>
+      <w:b w:val="1"/>
+      <w:bCs w:val="1"/>
     </w:rPr>
   </w:style>
   <w:style w:type="paragraph" w:styleId="Heading3">
@@ -1427,19 +1448,28 @@
     <w:qFormat/>
     <w:rsid w:val="00FC693F"/>
     <w:pPr>
+      <w:keepNext/>
       <w:pBdr>
         <w:bottom w:val="single" w:sz="8" w:space="4" w:color="4F81BD" w:themeColor="accent1"/>
       </w:pBdr>
-      <w:spacing w:after="140" w:line="240" w:lineRule="auto" w:before="160"/>
+      <w:spacing w:after="120" w:line="640" w:lineRule="exact" w:before="200"/>
       <w:contextualSpacing/>
     </w:pPr>
     <w:rPr>
-      <w:rFonts w:asciiTheme="majorHAnsi" w:eastAsiaTheme="majorEastAsia" w:hAnsiTheme="majorHAnsi" w:cstheme="majorBidi" w:ascii="Noto Naskh Arabic" w:hAnsi="Noto Naskh Arabic" w:cs="Noto Naskh Arabic"/>
-      <w:color w:val="16334A"/>
+      <w:rFonts w:asciiTheme="majorHAnsi" w:eastAsiaTheme="majorEastAsia" w:hAnsiTheme="majorHAnsi" w:cstheme="majorBidi"/>
+      <w:color w:val="17365D" w:themeColor="text2" w:themeShade="BF"/>
       <w:spacing w:val="5"/>
       <w:kern w:val="28"/>
       <w:sz w:val="52"/>
       <w:szCs w:val="52"/>
+      <w:rFonts w:ascii="Noto Sans Arabic" w:hAnsi="Noto Sans Arabic" w:cs="Noto Sans Arabic" w:eastAsia="Noto Sans Arabic"/>
+      <w:sz w:val="46"/>
+      <w:szCs w:val="46"/>
+      <w:rtl w:val="1"/>
+      <w:lang w:bidi="ar-EG"/>
+      <w:color w:val="18394D"/>
+      <w:b w:val="1"/>
+      <w:bCs w:val="1"/>
     </w:rPr>
   </w:style>
   <w:style w:type="character" w:customStyle="1" w:styleId="TitleChar">

</xml_diff>

<commit_message>
Refine document spacing and headings and add readable Arabic text
</commit_message>
<xml_diff>
--- a/Activity_Platform_Executive_Overview.docx
+++ b/Activity_Platform_Executive_Overview.docx
@@ -19,7 +19,7 @@
           <w:b w:val="1"/>
           <w:bCs w:val="1"/>
         </w:rPr>
-        <w:t>العرض التنفيذي  /  ٠١</w:t>
+        <w:t>العرض التنفيذي</w:t>
       </w:r>
     </w:p>
     <w:p>
@@ -28,6 +28,9 @@
         <w:widowControl/>
         <w:bidi w:val="1"/>
         <w:jc w:val="start"/>
+        <w:pBdr>
+          <w:bottom w:val="nil"/>
+        </w:pBdr>
       </w:pPr>
       <w:r>
         <w:t>منظومة تسجيل النشاط الطلابي</w:t>
@@ -56,8 +59,8 @@
       <w:r>
         <w:rPr>
           <w:rFonts w:ascii="Noto Sans Arabic" w:hAnsi="Noto Sans Arabic" w:cs="Noto Sans Arabic" w:eastAsia="Noto Sans Arabic"/>
-          <w:sz w:val="22"/>
-          <w:szCs w:val="22"/>
+          <w:sz w:val="23"/>
+          <w:szCs w:val="23"/>
           <w:rtl w:val="1"/>
           <w:lang w:bidi="ar-EG"/>
           <w:color w:val="18394D"/>
@@ -107,8 +110,8 @@
       <w:r>
         <w:rPr>
           <w:rFonts w:ascii="Noto Sans Arabic" w:hAnsi="Noto Sans Arabic" w:cs="Noto Sans Arabic" w:eastAsia="Noto Sans Arabic"/>
-          <w:sz w:val="22"/>
-          <w:szCs w:val="22"/>
+          <w:sz w:val="23"/>
+          <w:szCs w:val="23"/>
           <w:rtl w:val="1"/>
           <w:lang w:bidi="ar-EG"/>
           <w:color w:val="18394D"/>
@@ -129,8 +132,8 @@
       <w:r>
         <w:rPr>
           <w:rFonts w:ascii="Noto Sans Arabic" w:hAnsi="Noto Sans Arabic" w:cs="Noto Sans Arabic" w:eastAsia="Noto Sans Arabic"/>
-          <w:sz w:val="22"/>
-          <w:szCs w:val="22"/>
+          <w:sz w:val="23"/>
+          <w:szCs w:val="23"/>
           <w:rtl w:val="1"/>
           <w:lang w:bidi="ar-EG"/>
           <w:color w:val="18394D"/>
@@ -151,8 +154,8 @@
       <w:r>
         <w:rPr>
           <w:rFonts w:ascii="Noto Sans Arabic" w:hAnsi="Noto Sans Arabic" w:cs="Noto Sans Arabic" w:eastAsia="Noto Sans Arabic"/>
-          <w:sz w:val="22"/>
-          <w:szCs w:val="22"/>
+          <w:sz w:val="23"/>
+          <w:szCs w:val="23"/>
           <w:rtl w:val="1"/>
           <w:lang w:bidi="ar-EG"/>
           <w:color w:val="18394D"/>
@@ -173,8 +176,8 @@
       <w:r>
         <w:rPr>
           <w:rFonts w:ascii="Noto Sans Arabic" w:hAnsi="Noto Sans Arabic" w:cs="Noto Sans Arabic" w:eastAsia="Noto Sans Arabic"/>
-          <w:sz w:val="22"/>
-          <w:szCs w:val="22"/>
+          <w:sz w:val="23"/>
+          <w:szCs w:val="23"/>
           <w:rtl w:val="1"/>
           <w:lang w:bidi="ar-EG"/>
           <w:color w:val="18394D"/>
@@ -240,7 +243,7 @@
           <w:b w:val="1"/>
           <w:bCs w:val="1"/>
         </w:rPr>
-        <w:t>التشغيل والصلاحيات  /  ٠٢</w:t>
+        <w:t>التشغيل والصلاحيات</w:t>
       </w:r>
     </w:p>
     <w:p>
@@ -249,6 +252,9 @@
         <w:widowControl/>
         <w:bidi w:val="1"/>
         <w:jc w:val="start"/>
+        <w:pBdr>
+          <w:bottom w:val="nil"/>
+        </w:pBdr>
       </w:pPr>
       <w:r>
         <w:t>المراجعة وإدارة الحسابات</w:t>
@@ -272,7 +278,7 @@
         <w:jc w:val="start"/>
       </w:pPr>
       <w:r>
-        <w:t>بعد تسجيل الدخول، يظهر للموظف مدخل لوحة الإدارة. ويبحث عن الطالب بالرقم الجامعي الموجود على الكارنيه أساسًا، أو بالاسم أو الرقم القومي وفق الصلاحيات، ثم يفتح الطلب ويطّلع على بياناته ومرفقاته واستمارتِه.</w:t>
+        <w:t>بعد تسجيل الدخول، يظهر للموظف مدخل لوحة الإدارة. ويبحث عن الطالب بالرقم الجامعي الموجود على بطاقة الجامعة أساسًا، أو بالاسم أو الرقم القومي وفق الصلاحيات، ثم يفتح الطلب ويطّلع على بياناته ومرفقاته واستمارته.</w:t>
       </w:r>
     </w:p>
     <w:p>
@@ -314,8 +320,8 @@
       <w:r>
         <w:rPr>
           <w:rFonts w:ascii="Noto Sans Arabic" w:hAnsi="Noto Sans Arabic" w:cs="Noto Sans Arabic" w:eastAsia="Noto Sans Arabic"/>
-          <w:sz w:val="22"/>
-          <w:szCs w:val="22"/>
+          <w:sz w:val="23"/>
+          <w:szCs w:val="23"/>
           <w:rtl w:val="1"/>
           <w:lang w:bidi="ar-EG"/>
           <w:color w:val="18394D"/>
@@ -336,8 +342,8 @@
       <w:r>
         <w:rPr>
           <w:rFonts w:ascii="Noto Sans Arabic" w:hAnsi="Noto Sans Arabic" w:cs="Noto Sans Arabic" w:eastAsia="Noto Sans Arabic"/>
-          <w:sz w:val="22"/>
-          <w:szCs w:val="22"/>
+          <w:sz w:val="23"/>
+          <w:szCs w:val="23"/>
           <w:rtl w:val="1"/>
           <w:lang w:bidi="ar-EG"/>
           <w:color w:val="18394D"/>
@@ -358,8 +364,8 @@
       <w:r>
         <w:rPr>
           <w:rFonts w:ascii="Noto Sans Arabic" w:hAnsi="Noto Sans Arabic" w:cs="Noto Sans Arabic" w:eastAsia="Noto Sans Arabic"/>
-          <w:sz w:val="22"/>
-          <w:szCs w:val="22"/>
+          <w:sz w:val="23"/>
+          <w:szCs w:val="23"/>
           <w:rtl w:val="1"/>
           <w:lang w:bidi="ar-EG"/>
           <w:color w:val="18394D"/>
@@ -446,7 +452,7 @@
           <w:b w:val="1"/>
           <w:bCs w:val="1"/>
         </w:rPr>
-        <w:t>خطة العمل  /  ٠٣</w:t>
+        <w:t>خطة التنفيذ</w:t>
       </w:r>
     </w:p>
     <w:p>
@@ -455,6 +461,9 @@
         <w:widowControl/>
         <w:bidi w:val="1"/>
         <w:jc w:val="start"/>
+        <w:pBdr>
+          <w:bottom w:val="nil"/>
+        </w:pBdr>
       </w:pPr>
       <w:r>
         <w:t>التنفيذ والاختبار والتعميم</w:t>
@@ -479,8 +488,8 @@
       <w:r>
         <w:rPr>
           <w:rFonts w:ascii="Noto Sans Arabic" w:hAnsi="Noto Sans Arabic" w:cs="Noto Sans Arabic" w:eastAsia="Noto Sans Arabic"/>
-          <w:sz w:val="22"/>
-          <w:szCs w:val="22"/>
+          <w:sz w:val="23"/>
+          <w:szCs w:val="23"/>
           <w:rtl w:val="1"/>
           <w:lang w:bidi="ar-EG"/>
           <w:color w:val="18394D"/>
@@ -501,8 +510,8 @@
       <w:r>
         <w:rPr>
           <w:rFonts w:ascii="Noto Sans Arabic" w:hAnsi="Noto Sans Arabic" w:cs="Noto Sans Arabic" w:eastAsia="Noto Sans Arabic"/>
-          <w:sz w:val="22"/>
-          <w:szCs w:val="22"/>
+          <w:sz w:val="23"/>
+          <w:szCs w:val="23"/>
           <w:rtl w:val="1"/>
           <w:lang w:bidi="ar-EG"/>
           <w:color w:val="18394D"/>
@@ -523,8 +532,8 @@
       <w:r>
         <w:rPr>
           <w:rFonts w:ascii="Noto Sans Arabic" w:hAnsi="Noto Sans Arabic" w:cs="Noto Sans Arabic" w:eastAsia="Noto Sans Arabic"/>
-          <w:sz w:val="22"/>
-          <w:szCs w:val="22"/>
+          <w:sz w:val="23"/>
+          <w:szCs w:val="23"/>
           <w:rtl w:val="1"/>
           <w:lang w:bidi="ar-EG"/>
           <w:color w:val="18394D"/>
@@ -545,8 +554,8 @@
       <w:r>
         <w:rPr>
           <w:rFonts w:ascii="Noto Sans Arabic" w:hAnsi="Noto Sans Arabic" w:cs="Noto Sans Arabic" w:eastAsia="Noto Sans Arabic"/>
-          <w:sz w:val="22"/>
-          <w:szCs w:val="22"/>
+          <w:sz w:val="23"/>
+          <w:szCs w:val="23"/>
           <w:rtl w:val="1"/>
           <w:lang w:bidi="ar-EG"/>
           <w:color w:val="18394D"/>
@@ -567,8 +576,8 @@
       <w:r>
         <w:rPr>
           <w:rFonts w:ascii="Noto Sans Arabic" w:hAnsi="Noto Sans Arabic" w:cs="Noto Sans Arabic" w:eastAsia="Noto Sans Arabic"/>
-          <w:sz w:val="22"/>
-          <w:szCs w:val="22"/>
+          <w:sz w:val="23"/>
+          <w:szCs w:val="23"/>
           <w:rtl w:val="1"/>
           <w:lang w:bidi="ar-EG"/>
           <w:color w:val="18394D"/>
@@ -620,7 +629,7 @@
         <w:jc w:val="start"/>
       </w:pPr>
       <w:r>
-        <w:t>ما يلزم تحديده لاستكمال العمل</w:t>
+        <w:t>متطلبات استكمال التنفيذ</w:t>
       </w:r>
     </w:p>
     <w:p>
@@ -651,7 +660,7 @@
         <w:jc w:val="start"/>
       </w:pPr>
       <w:r>
-        <w:t>بعد نجاح دورة التقديم والاعتماد، وصحة الاستمارة والدرجة، ومنع تكرار الاستحقاق وتجاوز الصلاحيات، واجتياز اختبارات الاستخدام المتزامن والنسخ الاحتياطي والاسترجاع. ويُختبر الربط المركزي فعليًا قبل اعتماده، وتُحدد المواعيد والموارد بعد حسم المتطلبات.</w:t>
+        <w:t>تكون النسخة جاهزة بعد نجاح دورة التقديم والاعتماد، وصحة الاستمارة والدرجة، ومنع تكرار الاستحقاق وتجاوز الصلاحيات، واجتياز اختبارات الاستخدام المتزامن والنسخ الاحتياطي والاسترجاع. ويُختبر الربط المركزي فعليًا قبل اعتماده، وتُحدد المواعيد والموارد بعد حسم المتطلبات.</w:t>
       </w:r>
     </w:p>
     <w:sectPr>
@@ -1080,12 +1089,12 @@
     <w:qFormat/>
     <w:rsid w:val="00FC693F"/>
     <w:pPr>
-      <w:spacing w:line="380" w:lineRule="exact" w:after="140"/>
+      <w:spacing w:line="400" w:lineRule="exact" w:after="140"/>
     </w:pPr>
     <w:rPr>
       <w:rFonts w:ascii="Noto Sans Arabic" w:hAnsi="Noto Sans Arabic" w:cs="Noto Sans Arabic" w:eastAsia="Noto Sans Arabic"/>
-      <w:sz w:val="22"/>
-      <w:szCs w:val="22"/>
+      <w:sz w:val="23"/>
+      <w:szCs w:val="23"/>
       <w:rtl w:val="1"/>
       <w:lang w:bidi="ar-EG"/>
       <w:color w:val="24313B"/>
@@ -1146,7 +1155,7 @@
     <w:pPr>
       <w:keepNext/>
       <w:keepLines/>
-      <w:spacing w:before="200" w:after="120" w:line="460" w:lineRule="exact"/>
+      <w:spacing w:before="200" w:after="120" w:line="440" w:lineRule="exact"/>
       <w:outlineLvl w:val="0"/>
     </w:pPr>
     <w:rPr>
@@ -1157,8 +1166,8 @@
       <w:sz w:val="28"/>
       <w:szCs w:val="28"/>
       <w:rFonts w:ascii="Noto Sans Arabic" w:hAnsi="Noto Sans Arabic" w:cs="Noto Sans Arabic" w:eastAsia="Noto Sans Arabic"/>
-      <w:sz w:val="36"/>
-      <w:szCs w:val="36"/>
+      <w:sz w:val="34"/>
+      <w:szCs w:val="34"/>
       <w:rtl w:val="1"/>
       <w:lang w:bidi="ar-EG"/>
       <w:color w:val="18394D"/>
@@ -1178,7 +1187,7 @@
     <w:pPr>
       <w:keepNext/>
       <w:keepLines/>
-      <w:spacing w:before="200" w:after="120" w:line="460" w:lineRule="exact"/>
+      <w:spacing w:before="200" w:after="120" w:line="440" w:lineRule="exact"/>
       <w:outlineLvl w:val="1"/>
     </w:pPr>
     <w:rPr>
@@ -1189,8 +1198,8 @@
       <w:sz w:val="26"/>
       <w:szCs w:val="26"/>
       <w:rFonts w:ascii="Noto Sans Arabic" w:hAnsi="Noto Sans Arabic" w:cs="Noto Sans Arabic" w:eastAsia="Noto Sans Arabic"/>
-      <w:sz w:val="26"/>
-      <w:szCs w:val="26"/>
+      <w:sz w:val="27"/>
+      <w:szCs w:val="27"/>
       <w:rtl w:val="1"/>
       <w:lang w:bidi="ar-EG"/>
       <w:color w:val="18394D"/>
@@ -1452,7 +1461,7 @@
       <w:pBdr>
         <w:bottom w:val="single" w:sz="8" w:space="4" w:color="4F81BD" w:themeColor="accent1"/>
       </w:pBdr>
-      <w:spacing w:after="120" w:line="640" w:lineRule="exact" w:before="200"/>
+      <w:spacing w:after="120" w:line="580" w:lineRule="exact" w:before="200"/>
       <w:contextualSpacing/>
     </w:pPr>
     <w:rPr>
@@ -1463,8 +1472,8 @@
       <w:sz w:val="52"/>
       <w:szCs w:val="52"/>
       <w:rFonts w:ascii="Noto Sans Arabic" w:hAnsi="Noto Sans Arabic" w:cs="Noto Sans Arabic" w:eastAsia="Noto Sans Arabic"/>
-      <w:sz w:val="46"/>
-      <w:szCs w:val="46"/>
+      <w:sz w:val="42"/>
+      <w:szCs w:val="42"/>
       <w:rtl w:val="1"/>
       <w:lang w:bidi="ar-EG"/>
       <w:color w:val="18394D"/>

</xml_diff>